<commit_message>
Temperature new adjuted values
</commit_message>
<xml_diff>
--- a/Chebba_Roman_agronomic_model.docx
+++ b/Chebba_Roman_agronomic_model.docx
@@ -6375,14 +6375,6 @@
     </w:p>
     <w:p>
       <w:pPr>
-        <w:jc w:val="both"/>
-        <w:rPr>
-          <w:lang w:val="en-GB"/>
-        </w:rPr>
-      </w:pPr>
-    </w:p>
-    <w:p>
-      <w:pPr>
         <w:pStyle w:val="Ttulo2"/>
         <w:jc w:val="both"/>
         <w:rPr>
@@ -6394,7 +6386,7 @@
           <w:rFonts w:ascii="Times New Roman" w:eastAsia="Times New Roman" w:hAnsi="Times New Roman" w:cs="Times New Roman"/>
           <w:lang w:val="en-GB"/>
         </w:rPr>
-        <w:t>7</w:t>
+        <w:t>6</w:t>
       </w:r>
       <w:r>
         <w:rPr>
@@ -7579,13 +7571,1475 @@
       <w:pPr>
         <w:jc w:val="both"/>
         <w:rPr>
+          <w:b/>
+          <w:bCs/>
+          <w:lang w:val="en-GB"/>
+        </w:rPr>
+      </w:pPr>
+    </w:p>
+    <w:tbl>
+      <w:tblPr>
+        <w:tblStyle w:val="Tablaconcuadrcula"/>
+        <w:tblW w:w="0" w:type="auto"/>
+        <w:tblLook w:val="04A0" w:firstRow="1" w:lastRow="0" w:firstColumn="1" w:lastColumn="0" w:noHBand="0" w:noVBand="1"/>
+      </w:tblPr>
+      <w:tblGrid>
+        <w:gridCol w:w="4322"/>
+        <w:gridCol w:w="4322"/>
+      </w:tblGrid>
+      <w:tr>
+        <w:tc>
+          <w:tcPr>
+            <w:tcW w:w="4322" w:type="dxa"/>
+          </w:tcPr>
+          <w:p>
+            <w:pPr>
+              <w:jc w:val="both"/>
+              <w:rPr>
+                <w:b/>
+                <w:bCs/>
+                <w:lang w:val="en-GB"/>
+              </w:rPr>
+            </w:pPr>
+            <w:r>
+              <w:rPr>
+                <w:b/>
+                <w:bCs/>
+                <w:lang w:val="en-GB"/>
+              </w:rPr>
+              <w:t>Temperature interval</w:t>
+            </w:r>
+            <w:r>
+              <w:rPr>
+                <w:b/>
+                <w:bCs/>
+                <w:lang w:val="en-GB"/>
+              </w:rPr>
+              <w:t xml:space="preserve"> per year</w:t>
+            </w:r>
+          </w:p>
+        </w:tc>
+        <w:tc>
+          <w:tcPr>
+            <w:tcW w:w="4322" w:type="dxa"/>
+          </w:tcPr>
+          <w:p>
+            <w:pPr>
+              <w:jc w:val="both"/>
+              <w:rPr>
+                <w:b/>
+                <w:bCs/>
+                <w:lang w:val="en-GB"/>
+              </w:rPr>
+            </w:pPr>
+            <w:r>
+              <w:rPr>
+                <w:b/>
+                <w:bCs/>
+                <w:lang w:val="en-GB"/>
+              </w:rPr>
+              <w:t>Range</w:t>
+            </w:r>
+          </w:p>
+        </w:tc>
+      </w:tr>
+      <w:tr>
+        <w:tc>
+          <w:tcPr>
+            <w:tcW w:w="4322" w:type="dxa"/>
+          </w:tcPr>
+          <w:p>
+            <w:pPr>
+              <w:jc w:val="both"/>
+              <w:rPr>
+                <w:lang w:val="en-GB"/>
+              </w:rPr>
+            </w:pPr>
+            <w:r>
+              <w:rPr>
+                <w:lang w:val="en-GB"/>
+              </w:rPr>
+              <w:t>Cool</w:t>
+            </w:r>
+          </w:p>
+        </w:tc>
+        <w:tc>
+          <w:tcPr>
+            <w:tcW w:w="4322" w:type="dxa"/>
+          </w:tcPr>
+          <w:p>
+            <w:pPr>
+              <w:jc w:val="both"/>
+              <w:rPr>
+                <w:lang w:val="en-GB"/>
+              </w:rPr>
+            </w:pPr>
+            <w:r>
+              <w:rPr>
+                <w:lang w:val="en-GB"/>
+              </w:rPr>
+              <w:t>≤ 19.3 °C</w:t>
+            </w:r>
+          </w:p>
+        </w:tc>
+      </w:tr>
+      <w:tr>
+        <w:tc>
+          <w:tcPr>
+            <w:tcW w:w="4322" w:type="dxa"/>
+          </w:tcPr>
+          <w:p>
+            <w:pPr>
+              <w:jc w:val="both"/>
+              <w:rPr>
+                <w:lang w:val="en-GB"/>
+              </w:rPr>
+            </w:pPr>
+            <w:r>
+              <w:rPr>
+                <w:lang w:val="en-GB"/>
+              </w:rPr>
+              <w:t>Normal</w:t>
+            </w:r>
+          </w:p>
+        </w:tc>
+        <w:tc>
+          <w:tcPr>
+            <w:tcW w:w="4322" w:type="dxa"/>
+          </w:tcPr>
+          <w:p>
+            <w:pPr>
+              <w:jc w:val="both"/>
+              <w:rPr>
+                <w:lang w:val="en-GB"/>
+              </w:rPr>
+            </w:pPr>
+            <w:r>
+              <w:rPr>
+                <w:lang w:val="en-GB"/>
+              </w:rPr>
+              <w:t>19.4–20.3 °C</w:t>
+            </w:r>
+          </w:p>
+        </w:tc>
+      </w:tr>
+      <w:tr>
+        <w:tc>
+          <w:tcPr>
+            <w:tcW w:w="4322" w:type="dxa"/>
+          </w:tcPr>
+          <w:p>
+            <w:pPr>
+              <w:jc w:val="both"/>
+              <w:rPr>
+                <w:lang w:val="en-GB"/>
+              </w:rPr>
+            </w:pPr>
+            <w:r>
+              <w:rPr>
+                <w:lang w:val="en-GB"/>
+              </w:rPr>
+              <w:t>Warm</w:t>
+            </w:r>
+          </w:p>
+        </w:tc>
+        <w:tc>
+          <w:tcPr>
+            <w:tcW w:w="4322" w:type="dxa"/>
+          </w:tcPr>
+          <w:p>
+            <w:pPr>
+              <w:jc w:val="both"/>
+              <w:rPr>
+                <w:lang w:val="en-GB"/>
+              </w:rPr>
+            </w:pPr>
+            <w:r>
+              <w:rPr>
+                <w:lang w:val="en-GB"/>
+              </w:rPr>
+              <w:t>20.4–20.5 °C</w:t>
+            </w:r>
+          </w:p>
+        </w:tc>
+      </w:tr>
+      <w:tr>
+        <w:tc>
+          <w:tcPr>
+            <w:tcW w:w="4322" w:type="dxa"/>
+          </w:tcPr>
+          <w:p>
+            <w:pPr>
+              <w:jc w:val="both"/>
+              <w:rPr>
+                <w:lang w:val="en-GB"/>
+              </w:rPr>
+            </w:pPr>
+            <w:r>
+              <w:rPr>
+                <w:lang w:val="en-GB"/>
+              </w:rPr>
+              <w:lastRenderedPageBreak/>
+              <w:t>Very warm</w:t>
+            </w:r>
+          </w:p>
+        </w:tc>
+        <w:tc>
+          <w:tcPr>
+            <w:tcW w:w="4322" w:type="dxa"/>
+          </w:tcPr>
+          <w:p>
+            <w:pPr>
+              <w:jc w:val="both"/>
+              <w:rPr>
+                <w:lang w:val="en-GB"/>
+              </w:rPr>
+            </w:pPr>
+            <w:r>
+              <w:rPr>
+                <w:lang w:val="en-GB"/>
+              </w:rPr>
+              <w:t>≥ 20.6 °C</w:t>
+            </w:r>
+          </w:p>
+        </w:tc>
+      </w:tr>
+    </w:tbl>
+    <w:p>
+      <w:pPr>
+        <w:jc w:val="both"/>
+        <w:rPr>
+          <w:lang w:val="en-GB"/>
+        </w:rPr>
+      </w:pPr>
+    </w:p>
+    <w:tbl>
+      <w:tblPr>
+        <w:tblStyle w:val="Tablaconcuadrcula"/>
+        <w:tblW w:w="0" w:type="auto"/>
+        <w:tblLook w:val="04A0" w:firstRow="1" w:lastRow="0" w:firstColumn="1" w:lastColumn="0" w:noHBand="0" w:noVBand="1"/>
+      </w:tblPr>
+      <w:tblGrid>
+        <w:gridCol w:w="4322"/>
+        <w:gridCol w:w="4322"/>
+      </w:tblGrid>
+      <w:tr>
+        <w:tc>
+          <w:tcPr>
+            <w:tcW w:w="4322" w:type="dxa"/>
+          </w:tcPr>
+          <w:p>
+            <w:pPr>
+              <w:jc w:val="both"/>
+              <w:rPr>
+                <w:b/>
+                <w:bCs/>
+                <w:lang w:val="en-GB"/>
+              </w:rPr>
+            </w:pPr>
+            <w:r>
+              <w:rPr>
+                <w:b/>
+                <w:bCs/>
+                <w:lang w:val="en-GB"/>
+              </w:rPr>
+              <w:t>Temperature interval per year</w:t>
+            </w:r>
+          </w:p>
+        </w:tc>
+        <w:tc>
+          <w:tcPr>
+            <w:tcW w:w="4322" w:type="dxa"/>
+          </w:tcPr>
+          <w:p>
+            <w:pPr>
+              <w:jc w:val="both"/>
+              <w:rPr>
+                <w:b/>
+                <w:bCs/>
+                <w:lang w:val="en-GB"/>
+              </w:rPr>
+            </w:pPr>
+            <w:r>
+              <w:rPr>
+                <w:b/>
+                <w:bCs/>
+                <w:lang w:val="en-GB"/>
+              </w:rPr>
+              <w:t>Probabili</w:t>
+            </w:r>
+            <w:r>
+              <w:rPr>
+                <w:b/>
+                <w:bCs/>
+                <w:lang w:val="en-GB"/>
+              </w:rPr>
+              <w:t>ty for the Roman Climatic Optimum</w:t>
+            </w:r>
+          </w:p>
+        </w:tc>
+      </w:tr>
+      <w:tr>
+        <w:tc>
+          <w:tcPr>
+            <w:tcW w:w="4322" w:type="dxa"/>
+          </w:tcPr>
+          <w:p>
+            <w:pPr>
+              <w:jc w:val="both"/>
+              <w:rPr>
+                <w:lang w:val="en-GB"/>
+              </w:rPr>
+            </w:pPr>
+            <w:r>
+              <w:rPr>
+                <w:lang w:val="en-GB"/>
+              </w:rPr>
+              <w:t>Cool</w:t>
+            </w:r>
+          </w:p>
+        </w:tc>
+        <w:tc>
+          <w:tcPr>
+            <w:tcW w:w="4322" w:type="dxa"/>
+          </w:tcPr>
+          <w:p>
+            <w:pPr>
+              <w:jc w:val="both"/>
+              <w:rPr>
+                <w:lang w:val="en-GB"/>
+              </w:rPr>
+            </w:pPr>
+            <w:r>
+              <w:rPr>
+                <w:lang w:val="en-GB"/>
+              </w:rPr>
+              <w:t>10%</w:t>
+            </w:r>
+          </w:p>
+        </w:tc>
+      </w:tr>
+      <w:tr>
+        <w:tc>
+          <w:tcPr>
+            <w:tcW w:w="4322" w:type="dxa"/>
+          </w:tcPr>
+          <w:p>
+            <w:pPr>
+              <w:jc w:val="both"/>
+              <w:rPr>
+                <w:lang w:val="en-GB"/>
+              </w:rPr>
+            </w:pPr>
+            <w:r>
+              <w:rPr>
+                <w:lang w:val="en-GB"/>
+              </w:rPr>
+              <w:t>Normal</w:t>
+            </w:r>
+          </w:p>
+        </w:tc>
+        <w:tc>
+          <w:tcPr>
+            <w:tcW w:w="4322" w:type="dxa"/>
+          </w:tcPr>
+          <w:p>
+            <w:pPr>
+              <w:jc w:val="both"/>
+              <w:rPr>
+                <w:lang w:val="en-GB"/>
+              </w:rPr>
+            </w:pPr>
+            <w:r>
+              <w:rPr>
+                <w:lang w:val="en-GB"/>
+              </w:rPr>
+              <w:t>45%</w:t>
+            </w:r>
+          </w:p>
+        </w:tc>
+      </w:tr>
+      <w:tr>
+        <w:tc>
+          <w:tcPr>
+            <w:tcW w:w="4322" w:type="dxa"/>
+          </w:tcPr>
+          <w:p>
+            <w:pPr>
+              <w:jc w:val="both"/>
+              <w:rPr>
+                <w:lang w:val="en-GB"/>
+              </w:rPr>
+            </w:pPr>
+            <w:r>
+              <w:rPr>
+                <w:lang w:val="en-GB"/>
+              </w:rPr>
+              <w:t>Warm</w:t>
+            </w:r>
+          </w:p>
+        </w:tc>
+        <w:tc>
+          <w:tcPr>
+            <w:tcW w:w="4322" w:type="dxa"/>
+          </w:tcPr>
+          <w:p>
+            <w:pPr>
+              <w:jc w:val="both"/>
+              <w:rPr>
+                <w:lang w:val="en-GB"/>
+              </w:rPr>
+            </w:pPr>
+            <w:r>
+              <w:rPr>
+                <w:lang w:val="en-GB"/>
+              </w:rPr>
+              <w:t>35%</w:t>
+            </w:r>
+          </w:p>
+        </w:tc>
+      </w:tr>
+      <w:tr>
+        <w:tc>
+          <w:tcPr>
+            <w:tcW w:w="4322" w:type="dxa"/>
+          </w:tcPr>
+          <w:p>
+            <w:pPr>
+              <w:jc w:val="both"/>
+              <w:rPr>
+                <w:lang w:val="en-GB"/>
+              </w:rPr>
+            </w:pPr>
+            <w:r>
+              <w:rPr>
+                <w:lang w:val="en-GB"/>
+              </w:rPr>
+              <w:t>Very warm</w:t>
+            </w:r>
+          </w:p>
+        </w:tc>
+        <w:tc>
+          <w:tcPr>
+            <w:tcW w:w="4322" w:type="dxa"/>
+          </w:tcPr>
+          <w:p>
+            <w:pPr>
+              <w:jc w:val="both"/>
+              <w:rPr>
+                <w:lang w:val="en-GB"/>
+              </w:rPr>
+            </w:pPr>
+            <w:r>
+              <w:rPr>
+                <w:lang w:val="en-GB"/>
+              </w:rPr>
+              <w:t>10%</w:t>
+            </w:r>
+          </w:p>
+        </w:tc>
+      </w:tr>
+    </w:tbl>
+    <w:p>
+      <w:pPr>
+        <w:jc w:val="both"/>
+        <w:rPr>
+          <w:lang w:val="en-GB"/>
+        </w:rPr>
+      </w:pPr>
+    </w:p>
+    <w:tbl>
+      <w:tblPr>
+        <w:tblStyle w:val="Tablaconcuadrcula"/>
+        <w:tblW w:w="0" w:type="auto"/>
+        <w:tblLook w:val="04A0" w:firstRow="1" w:lastRow="0" w:firstColumn="1" w:lastColumn="0" w:noHBand="0" w:noVBand="1"/>
+      </w:tblPr>
+      <w:tblGrid>
+        <w:gridCol w:w="4322"/>
+        <w:gridCol w:w="4322"/>
+      </w:tblGrid>
+      <w:tr>
+        <w:tc>
+          <w:tcPr>
+            <w:tcW w:w="4322" w:type="dxa"/>
+          </w:tcPr>
+          <w:p>
+            <w:pPr>
+              <w:jc w:val="both"/>
+              <w:rPr>
+                <w:b/>
+                <w:bCs/>
+                <w:lang w:val="en-GB"/>
+              </w:rPr>
+            </w:pPr>
+            <w:r>
+              <w:rPr>
+                <w:b/>
+                <w:bCs/>
+                <w:lang w:val="en-GB"/>
+              </w:rPr>
+              <w:t>Rainfall interval per year</w:t>
+            </w:r>
+          </w:p>
+        </w:tc>
+        <w:tc>
+          <w:tcPr>
+            <w:tcW w:w="4322" w:type="dxa"/>
+          </w:tcPr>
+          <w:p>
+            <w:pPr>
+              <w:jc w:val="both"/>
+              <w:rPr>
+                <w:b/>
+                <w:bCs/>
+                <w:lang w:val="en-GB"/>
+              </w:rPr>
+            </w:pPr>
+            <w:r>
+              <w:rPr>
+                <w:b/>
+                <w:bCs/>
+                <w:lang w:val="en-GB"/>
+              </w:rPr>
+              <w:t>Range</w:t>
+            </w:r>
+          </w:p>
+        </w:tc>
+      </w:tr>
+      <w:tr>
+        <w:tc>
+          <w:tcPr>
+            <w:tcW w:w="4322" w:type="dxa"/>
+          </w:tcPr>
+          <w:p>
+            <w:pPr>
+              <w:jc w:val="both"/>
+              <w:rPr>
+                <w:lang w:val="en-GB"/>
+              </w:rPr>
+            </w:pPr>
+            <w:r>
+              <w:rPr>
+                <w:lang w:val="en-GB"/>
+              </w:rPr>
+              <w:t>Very dry</w:t>
+            </w:r>
+          </w:p>
+        </w:tc>
+        <w:tc>
+          <w:tcPr>
+            <w:tcW w:w="4322" w:type="dxa"/>
+          </w:tcPr>
+          <w:p>
+            <w:pPr>
+              <w:jc w:val="both"/>
+              <w:rPr>
+                <w:lang w:val="en-GB"/>
+              </w:rPr>
+            </w:pPr>
+            <w:r>
+              <w:rPr>
+                <w:lang w:val="en-GB"/>
+              </w:rPr>
+              <w:t>≤ 123 mm</w:t>
+            </w:r>
+          </w:p>
+        </w:tc>
+      </w:tr>
+      <w:tr>
+        <w:tc>
+          <w:tcPr>
+            <w:tcW w:w="4322" w:type="dxa"/>
+          </w:tcPr>
+          <w:p>
+            <w:pPr>
+              <w:jc w:val="both"/>
+              <w:rPr>
+                <w:lang w:val="en-GB"/>
+              </w:rPr>
+            </w:pPr>
+            <w:r>
+              <w:rPr>
+                <w:lang w:val="en-GB"/>
+              </w:rPr>
+              <w:t>Dry</w:t>
+            </w:r>
+          </w:p>
+        </w:tc>
+        <w:tc>
+          <w:tcPr>
+            <w:tcW w:w="4322" w:type="dxa"/>
+          </w:tcPr>
+          <w:p>
+            <w:pPr>
+              <w:jc w:val="both"/>
+              <w:rPr>
+                <w:lang w:val="en-GB"/>
+              </w:rPr>
+            </w:pPr>
+            <w:r>
+              <w:rPr>
+                <w:lang w:val="en-GB"/>
+              </w:rPr>
+              <w:t>124–163 mm</w:t>
+            </w:r>
+          </w:p>
+        </w:tc>
+      </w:tr>
+      <w:tr>
+        <w:tc>
+          <w:tcPr>
+            <w:tcW w:w="4322" w:type="dxa"/>
+          </w:tcPr>
+          <w:p>
+            <w:pPr>
+              <w:jc w:val="both"/>
+              <w:rPr>
+                <w:lang w:val="en-GB"/>
+              </w:rPr>
+            </w:pPr>
+            <w:r>
+              <w:rPr>
+                <w:lang w:val="en-GB"/>
+              </w:rPr>
+              <w:t>Normal</w:t>
+            </w:r>
+          </w:p>
+        </w:tc>
+        <w:tc>
+          <w:tcPr>
+            <w:tcW w:w="4322" w:type="dxa"/>
+          </w:tcPr>
+          <w:p>
+            <w:pPr>
+              <w:jc w:val="both"/>
+              <w:rPr>
+                <w:lang w:val="en-GB"/>
+              </w:rPr>
+            </w:pPr>
+            <w:r>
+              <w:rPr>
+                <w:lang w:val="en-GB"/>
+              </w:rPr>
+              <w:t>164–297 mm</w:t>
+            </w:r>
+          </w:p>
+        </w:tc>
+      </w:tr>
+      <w:tr>
+        <w:tc>
+          <w:tcPr>
+            <w:tcW w:w="4322" w:type="dxa"/>
+          </w:tcPr>
+          <w:p>
+            <w:pPr>
+              <w:jc w:val="both"/>
+              <w:rPr>
+                <w:lang w:val="en-GB"/>
+              </w:rPr>
+            </w:pPr>
+            <w:r>
+              <w:rPr>
+                <w:lang w:val="en-GB"/>
+              </w:rPr>
+              <w:t>Humid</w:t>
+            </w:r>
+          </w:p>
+        </w:tc>
+        <w:tc>
+          <w:tcPr>
+            <w:tcW w:w="4322" w:type="dxa"/>
+          </w:tcPr>
+          <w:p>
+            <w:pPr>
+              <w:jc w:val="both"/>
+              <w:rPr>
+                <w:lang w:val="en-GB"/>
+              </w:rPr>
+            </w:pPr>
+            <w:r>
+              <w:rPr>
+                <w:lang w:val="en-GB"/>
+              </w:rPr>
+              <w:t>&gt; 297 mm</w:t>
+            </w:r>
+          </w:p>
+        </w:tc>
+      </w:tr>
+    </w:tbl>
+    <w:p>
+      <w:pPr>
+        <w:rPr>
+          <w:lang w:val="en-GB"/>
+        </w:rPr>
+      </w:pPr>
+    </w:p>
+    <w:tbl>
+      <w:tblPr>
+        <w:tblStyle w:val="Tablaconcuadrcula"/>
+        <w:tblW w:w="0" w:type="auto"/>
+        <w:tblLook w:val="04A0" w:firstRow="1" w:lastRow="0" w:firstColumn="1" w:lastColumn="0" w:noHBand="0" w:noVBand="1"/>
+      </w:tblPr>
+      <w:tblGrid>
+        <w:gridCol w:w="4322"/>
+        <w:gridCol w:w="4322"/>
+      </w:tblGrid>
+      <w:tr>
+        <w:tc>
+          <w:tcPr>
+            <w:tcW w:w="4322" w:type="dxa"/>
+          </w:tcPr>
+          <w:p>
+            <w:pPr>
+              <w:rPr>
+                <w:b/>
+                <w:bCs/>
+                <w:lang w:val="en-GB"/>
+              </w:rPr>
+            </w:pPr>
+            <w:r>
+              <w:rPr>
+                <w:b/>
+                <w:bCs/>
+                <w:lang w:val="en-GB"/>
+              </w:rPr>
+              <w:t>Rainfall interval per year</w:t>
+            </w:r>
+          </w:p>
+        </w:tc>
+        <w:tc>
+          <w:tcPr>
+            <w:tcW w:w="4322" w:type="dxa"/>
+          </w:tcPr>
+          <w:p>
+            <w:pPr>
+              <w:rPr>
+                <w:b/>
+                <w:bCs/>
+                <w:lang w:val="en-GB"/>
+              </w:rPr>
+            </w:pPr>
+            <w:r>
+              <w:rPr>
+                <w:b/>
+                <w:bCs/>
+                <w:lang w:val="en-GB"/>
+              </w:rPr>
+              <w:t>Probability for the Roman Climatic Optimum</w:t>
+            </w:r>
+          </w:p>
+        </w:tc>
+      </w:tr>
+      <w:tr>
+        <w:tc>
+          <w:tcPr>
+            <w:tcW w:w="4322" w:type="dxa"/>
+          </w:tcPr>
+          <w:p>
+            <w:pPr>
+              <w:rPr>
+                <w:lang w:val="en-GB"/>
+              </w:rPr>
+            </w:pPr>
+            <w:r>
+              <w:rPr>
+                <w:lang w:val="en-GB"/>
+              </w:rPr>
+              <w:t>Very dry</w:t>
+            </w:r>
+          </w:p>
+        </w:tc>
+        <w:tc>
+          <w:tcPr>
+            <w:tcW w:w="4322" w:type="dxa"/>
+          </w:tcPr>
+          <w:p>
+            <w:pPr>
+              <w:rPr>
+                <w:lang w:val="en-GB"/>
+              </w:rPr>
+            </w:pPr>
+            <w:r>
+              <w:rPr>
+                <w:lang w:val="en-GB"/>
+              </w:rPr>
+              <w:t>12.5%</w:t>
+            </w:r>
+          </w:p>
+        </w:tc>
+      </w:tr>
+      <w:tr>
+        <w:tc>
+          <w:tcPr>
+            <w:tcW w:w="4322" w:type="dxa"/>
+          </w:tcPr>
+          <w:p>
+            <w:pPr>
+              <w:rPr>
+                <w:lang w:val="en-GB"/>
+              </w:rPr>
+            </w:pPr>
+            <w:r>
+              <w:rPr>
+                <w:lang w:val="en-GB"/>
+              </w:rPr>
+              <w:t>Dry</w:t>
+            </w:r>
+          </w:p>
+        </w:tc>
+        <w:tc>
+          <w:tcPr>
+            <w:tcW w:w="4322" w:type="dxa"/>
+          </w:tcPr>
+          <w:p>
+            <w:pPr>
+              <w:rPr>
+                <w:lang w:val="en-GB"/>
+              </w:rPr>
+            </w:pPr>
+            <w:r>
+              <w:rPr>
+                <w:lang w:val="en-GB"/>
+              </w:rPr>
+              <w:t>12.5%</w:t>
+            </w:r>
+          </w:p>
+        </w:tc>
+      </w:tr>
+      <w:tr>
+        <w:tc>
+          <w:tcPr>
+            <w:tcW w:w="4322" w:type="dxa"/>
+          </w:tcPr>
+          <w:p>
+            <w:pPr>
+              <w:rPr>
+                <w:lang w:val="en-GB"/>
+              </w:rPr>
+            </w:pPr>
+            <w:r>
+              <w:rPr>
+                <w:lang w:val="en-GB"/>
+              </w:rPr>
+              <w:t>Normal</w:t>
+            </w:r>
+          </w:p>
+        </w:tc>
+        <w:tc>
+          <w:tcPr>
+            <w:tcW w:w="4322" w:type="dxa"/>
+          </w:tcPr>
+          <w:p>
+            <w:pPr>
+              <w:rPr>
+                <w:lang w:val="en-GB"/>
+              </w:rPr>
+            </w:pPr>
+            <w:r>
+              <w:rPr>
+                <w:lang w:val="en-GB"/>
+              </w:rPr>
+              <w:t>50.0%</w:t>
+            </w:r>
+          </w:p>
+        </w:tc>
+      </w:tr>
+      <w:tr>
+        <w:tc>
+          <w:tcPr>
+            <w:tcW w:w="4322" w:type="dxa"/>
+          </w:tcPr>
+          <w:p>
+            <w:pPr>
+              <w:rPr>
+                <w:lang w:val="en-GB"/>
+              </w:rPr>
+            </w:pPr>
+            <w:r>
+              <w:rPr>
+                <w:lang w:val="en-GB"/>
+              </w:rPr>
+              <w:t>Humid</w:t>
+            </w:r>
+          </w:p>
+        </w:tc>
+        <w:tc>
+          <w:tcPr>
+            <w:tcW w:w="4322" w:type="dxa"/>
+          </w:tcPr>
+          <w:p>
+            <w:pPr>
+              <w:rPr>
+                <w:lang w:val="en-GB"/>
+              </w:rPr>
+            </w:pPr>
+            <w:r>
+              <w:rPr>
+                <w:lang w:val="en-GB"/>
+              </w:rPr>
+              <w:t>25.0%</w:t>
+            </w:r>
+          </w:p>
+        </w:tc>
+      </w:tr>
+    </w:tbl>
+    <w:p>
+      <w:pPr>
+        <w:rPr>
           <w:lang w:val="en-GB"/>
         </w:rPr>
       </w:pPr>
     </w:p>
     <w:p>
       <w:pPr>
-        <w:jc w:val="both"/>
+        <w:rPr>
+          <w:b/>
+          <w:bCs/>
+          <w:lang w:val="en-GB"/>
+        </w:rPr>
+      </w:pPr>
+      <w:r>
+        <w:rPr>
+          <w:b/>
+          <w:bCs/>
+          <w:lang w:val="en-GB"/>
+        </w:rPr>
+        <w:t xml:space="preserve">6.5 Wheater effects of crops </w:t>
+      </w:r>
+    </w:p>
+    <w:p>
+      <w:pPr>
+        <w:rPr>
+          <w:lang w:val="en-GB"/>
+        </w:rPr>
+      </w:pPr>
+      <w:r>
+        <w:rPr>
+          <w:lang w:val="en-GB"/>
+        </w:rPr>
+        <w:t>6.5.1Wheat</w:t>
+      </w:r>
+    </w:p>
+    <w:tbl>
+      <w:tblPr>
+        <w:tblStyle w:val="Tablaconcuadrcula"/>
+        <w:tblW w:w="0" w:type="auto"/>
+        <w:tblLook w:val="04A0" w:firstRow="1" w:lastRow="0" w:firstColumn="1" w:lastColumn="0" w:noHBand="0" w:noVBand="1"/>
+      </w:tblPr>
+      <w:tblGrid>
+        <w:gridCol w:w="1728"/>
+        <w:gridCol w:w="1729"/>
+        <w:gridCol w:w="1729"/>
+        <w:gridCol w:w="1729"/>
+        <w:gridCol w:w="1729"/>
+      </w:tblGrid>
+      <w:tr>
+        <w:tc>
+          <w:tcPr>
+            <w:tcW w:w="1728" w:type="dxa"/>
+          </w:tcPr>
+          <w:p>
+            <w:pPr>
+              <w:rPr>
+                <w:b/>
+                <w:bCs/>
+                <w:lang w:val="en-GB"/>
+              </w:rPr>
+            </w:pPr>
+            <w:r>
+              <w:rPr>
+                <w:b/>
+                <w:bCs/>
+                <w:lang w:val="en-GB"/>
+              </w:rPr>
+              <w:t>Rainfall / Temperature</w:t>
+            </w:r>
+            <w:r>
+              <w:rPr>
+                <w:b/>
+                <w:bCs/>
+                <w:lang w:val="en-GB"/>
+              </w:rPr>
+              <w:t xml:space="preserve"> </w:t>
+            </w:r>
+          </w:p>
+        </w:tc>
+        <w:tc>
+          <w:tcPr>
+            <w:tcW w:w="1729" w:type="dxa"/>
+          </w:tcPr>
+          <w:p>
+            <w:pPr>
+              <w:rPr>
+                <w:b/>
+                <w:bCs/>
+                <w:lang w:val="en-GB"/>
+              </w:rPr>
+            </w:pPr>
+            <w:r>
+              <w:rPr>
+                <w:b/>
+                <w:bCs/>
+                <w:lang w:val="en-GB"/>
+              </w:rPr>
+              <w:t>Cool</w:t>
+            </w:r>
+          </w:p>
+        </w:tc>
+        <w:tc>
+          <w:tcPr>
+            <w:tcW w:w="1729" w:type="dxa"/>
+          </w:tcPr>
+          <w:p>
+            <w:pPr>
+              <w:rPr>
+                <w:b/>
+                <w:bCs/>
+                <w:lang w:val="en-GB"/>
+              </w:rPr>
+            </w:pPr>
+            <w:r>
+              <w:rPr>
+                <w:b/>
+                <w:bCs/>
+                <w:lang w:val="en-GB"/>
+              </w:rPr>
+              <w:t>Normal</w:t>
+            </w:r>
+          </w:p>
+        </w:tc>
+        <w:tc>
+          <w:tcPr>
+            <w:tcW w:w="1729" w:type="dxa"/>
+          </w:tcPr>
+          <w:p>
+            <w:pPr>
+              <w:rPr>
+                <w:b/>
+                <w:bCs/>
+                <w:lang w:val="en-GB"/>
+              </w:rPr>
+            </w:pPr>
+            <w:r>
+              <w:rPr>
+                <w:b/>
+                <w:bCs/>
+                <w:lang w:val="en-GB"/>
+              </w:rPr>
+              <w:t>Warm</w:t>
+            </w:r>
+          </w:p>
+        </w:tc>
+        <w:tc>
+          <w:tcPr>
+            <w:tcW w:w="1729" w:type="dxa"/>
+          </w:tcPr>
+          <w:p>
+            <w:pPr>
+              <w:rPr>
+                <w:b/>
+                <w:bCs/>
+                <w:lang w:val="en-GB"/>
+              </w:rPr>
+            </w:pPr>
+            <w:r>
+              <w:rPr>
+                <w:b/>
+                <w:bCs/>
+                <w:lang w:val="en-GB"/>
+              </w:rPr>
+              <w:t>Very warm</w:t>
+            </w:r>
+          </w:p>
+        </w:tc>
+      </w:tr>
+      <w:tr>
+        <w:tc>
+          <w:tcPr>
+            <w:tcW w:w="1728" w:type="dxa"/>
+          </w:tcPr>
+          <w:p>
+            <w:pPr>
+              <w:rPr>
+                <w:b/>
+                <w:bCs/>
+                <w:lang w:val="en-GB"/>
+              </w:rPr>
+            </w:pPr>
+            <w:r>
+              <w:rPr>
+                <w:b/>
+                <w:bCs/>
+                <w:lang w:val="en-GB"/>
+              </w:rPr>
+              <w:t>Very dry</w:t>
+            </w:r>
+          </w:p>
+        </w:tc>
+        <w:tc>
+          <w:tcPr>
+            <w:tcW w:w="1729" w:type="dxa"/>
+          </w:tcPr>
+          <w:p>
+            <w:pPr>
+              <w:rPr>
+                <w:lang w:val="en-GB"/>
+              </w:rPr>
+            </w:pPr>
+            <w:r>
+              <w:rPr>
+                <w:lang w:val="en-GB"/>
+              </w:rPr>
+              <w:t>0.47</w:t>
+            </w:r>
+          </w:p>
+        </w:tc>
+        <w:tc>
+          <w:tcPr>
+            <w:tcW w:w="1729" w:type="dxa"/>
+          </w:tcPr>
+          <w:p>
+            <w:pPr>
+              <w:rPr>
+                <w:lang w:val="en-GB"/>
+              </w:rPr>
+            </w:pPr>
+            <w:r>
+              <w:rPr>
+                <w:lang w:val="en-GB"/>
+              </w:rPr>
+              <w:t>0.45</w:t>
+            </w:r>
+          </w:p>
+        </w:tc>
+        <w:tc>
+          <w:tcPr>
+            <w:tcW w:w="1729" w:type="dxa"/>
+          </w:tcPr>
+          <w:p>
+            <w:pPr>
+              <w:rPr>
+                <w:lang w:val="en-GB"/>
+              </w:rPr>
+            </w:pPr>
+            <w:r>
+              <w:rPr>
+                <w:lang w:val="en-GB"/>
+              </w:rPr>
+              <w:t>0.41</w:t>
+            </w:r>
+          </w:p>
+        </w:tc>
+        <w:tc>
+          <w:tcPr>
+            <w:tcW w:w="1729" w:type="dxa"/>
+          </w:tcPr>
+          <w:p>
+            <w:pPr>
+              <w:rPr>
+                <w:lang w:val="en-GB"/>
+              </w:rPr>
+            </w:pPr>
+            <w:r>
+              <w:rPr>
+                <w:lang w:val="en-GB"/>
+              </w:rPr>
+              <w:t>0.31</w:t>
+            </w:r>
+          </w:p>
+        </w:tc>
+      </w:tr>
+      <w:tr>
+        <w:tc>
+          <w:tcPr>
+            <w:tcW w:w="1728" w:type="dxa"/>
+          </w:tcPr>
+          <w:p>
+            <w:pPr>
+              <w:rPr>
+                <w:b/>
+                <w:bCs/>
+                <w:lang w:val="en-GB"/>
+              </w:rPr>
+            </w:pPr>
+            <w:r>
+              <w:rPr>
+                <w:b/>
+                <w:bCs/>
+                <w:lang w:val="en-GB"/>
+              </w:rPr>
+              <w:t>Dry</w:t>
+            </w:r>
+          </w:p>
+        </w:tc>
+        <w:tc>
+          <w:tcPr>
+            <w:tcW w:w="1729" w:type="dxa"/>
+          </w:tcPr>
+          <w:p>
+            <w:pPr>
+              <w:rPr>
+                <w:lang w:val="en-GB"/>
+              </w:rPr>
+            </w:pPr>
+            <w:r>
+              <w:rPr>
+                <w:lang w:val="en-GB"/>
+              </w:rPr>
+              <w:t>0.68</w:t>
+            </w:r>
+          </w:p>
+        </w:tc>
+        <w:tc>
+          <w:tcPr>
+            <w:tcW w:w="1729" w:type="dxa"/>
+          </w:tcPr>
+          <w:p>
+            <w:pPr>
+              <w:rPr>
+                <w:lang w:val="en-GB"/>
+              </w:rPr>
+            </w:pPr>
+            <w:r>
+              <w:rPr>
+                <w:lang w:val="en-GB"/>
+              </w:rPr>
+              <w:t>0.65</w:t>
+            </w:r>
+          </w:p>
+        </w:tc>
+        <w:tc>
+          <w:tcPr>
+            <w:tcW w:w="1729" w:type="dxa"/>
+          </w:tcPr>
+          <w:p>
+            <w:pPr>
+              <w:rPr>
+                <w:lang w:val="en-GB"/>
+              </w:rPr>
+            </w:pPr>
+            <w:r>
+              <w:rPr>
+                <w:lang w:val="en-GB"/>
+              </w:rPr>
+              <w:t>0.60</w:t>
+            </w:r>
+          </w:p>
+        </w:tc>
+        <w:tc>
+          <w:tcPr>
+            <w:tcW w:w="1729" w:type="dxa"/>
+          </w:tcPr>
+          <w:p>
+            <w:pPr>
+              <w:rPr>
+                <w:lang w:val="en-GB"/>
+              </w:rPr>
+            </w:pPr>
+            <w:r>
+              <w:rPr>
+                <w:lang w:val="en-GB"/>
+              </w:rPr>
+              <w:t>0.52</w:t>
+            </w:r>
+          </w:p>
+        </w:tc>
+      </w:tr>
+      <w:tr>
+        <w:tc>
+          <w:tcPr>
+            <w:tcW w:w="1728" w:type="dxa"/>
+          </w:tcPr>
+          <w:p>
+            <w:pPr>
+              <w:rPr>
+                <w:b/>
+                <w:bCs/>
+                <w:lang w:val="en-GB"/>
+              </w:rPr>
+            </w:pPr>
+            <w:r>
+              <w:rPr>
+                <w:b/>
+                <w:bCs/>
+                <w:lang w:val="en-GB"/>
+              </w:rPr>
+              <w:t>Normal</w:t>
+            </w:r>
+          </w:p>
+        </w:tc>
+        <w:tc>
+          <w:tcPr>
+            <w:tcW w:w="1729" w:type="dxa"/>
+          </w:tcPr>
+          <w:p>
+            <w:pPr>
+              <w:rPr>
+                <w:lang w:val="en-GB"/>
+              </w:rPr>
+            </w:pPr>
+            <w:r>
+              <w:rPr>
+                <w:lang w:val="en-GB"/>
+              </w:rPr>
+              <w:t>1.05</w:t>
+            </w:r>
+          </w:p>
+        </w:tc>
+        <w:tc>
+          <w:tcPr>
+            <w:tcW w:w="1729" w:type="dxa"/>
+          </w:tcPr>
+          <w:p>
+            <w:pPr>
+              <w:rPr>
+                <w:lang w:val="en-GB"/>
+              </w:rPr>
+            </w:pPr>
+            <w:r>
+              <w:rPr>
+                <w:lang w:val="en-GB"/>
+              </w:rPr>
+              <w:t>1.00</w:t>
+            </w:r>
+          </w:p>
+        </w:tc>
+        <w:tc>
+          <w:tcPr>
+            <w:tcW w:w="1729" w:type="dxa"/>
+          </w:tcPr>
+          <w:p>
+            <w:pPr>
+              <w:rPr>
+                <w:lang w:val="en-GB"/>
+              </w:rPr>
+            </w:pPr>
+            <w:r>
+              <w:rPr>
+                <w:lang w:val="en-GB"/>
+              </w:rPr>
+              <w:t>0.92</w:t>
+            </w:r>
+          </w:p>
+        </w:tc>
+        <w:tc>
+          <w:tcPr>
+            <w:tcW w:w="1729" w:type="dxa"/>
+          </w:tcPr>
+          <w:p>
+            <w:pPr>
+              <w:rPr>
+                <w:lang w:val="en-GB"/>
+              </w:rPr>
+            </w:pPr>
+            <w:r>
+              <w:rPr>
+                <w:lang w:val="en-GB"/>
+              </w:rPr>
+              <w:t>0.80</w:t>
+            </w:r>
+          </w:p>
+        </w:tc>
+      </w:tr>
+      <w:tr>
+        <w:tc>
+          <w:tcPr>
+            <w:tcW w:w="1728" w:type="dxa"/>
+          </w:tcPr>
+          <w:p>
+            <w:pPr>
+              <w:rPr>
+                <w:b/>
+                <w:bCs/>
+                <w:lang w:val="en-GB"/>
+              </w:rPr>
+            </w:pPr>
+            <w:r>
+              <w:rPr>
+                <w:b/>
+                <w:bCs/>
+                <w:lang w:val="en-GB"/>
+              </w:rPr>
+              <w:t>Humid</w:t>
+            </w:r>
+          </w:p>
+        </w:tc>
+        <w:tc>
+          <w:tcPr>
+            <w:tcW w:w="1729" w:type="dxa"/>
+          </w:tcPr>
+          <w:p>
+            <w:pPr>
+              <w:rPr>
+                <w:lang w:val="en-GB"/>
+              </w:rPr>
+            </w:pPr>
+            <w:r>
+              <w:rPr>
+                <w:lang w:val="en-GB"/>
+              </w:rPr>
+              <w:t>1.20</w:t>
+            </w:r>
+          </w:p>
+        </w:tc>
+        <w:tc>
+          <w:tcPr>
+            <w:tcW w:w="1729" w:type="dxa"/>
+          </w:tcPr>
+          <w:p>
+            <w:pPr>
+              <w:rPr>
+                <w:lang w:val="en-GB"/>
+              </w:rPr>
+            </w:pPr>
+            <w:r>
+              <w:rPr>
+                <w:lang w:val="en-GB"/>
+              </w:rPr>
+              <w:t>1.15</w:t>
+            </w:r>
+          </w:p>
+        </w:tc>
+        <w:tc>
+          <w:tcPr>
+            <w:tcW w:w="1729" w:type="dxa"/>
+          </w:tcPr>
+          <w:p>
+            <w:pPr>
+              <w:rPr>
+                <w:lang w:val="en-GB"/>
+              </w:rPr>
+            </w:pPr>
+            <w:r>
+              <w:rPr>
+                <w:lang w:val="en-GB"/>
+              </w:rPr>
+              <w:t>1.06</w:t>
+            </w:r>
+          </w:p>
+        </w:tc>
+        <w:tc>
+          <w:tcPr>
+            <w:tcW w:w="1729" w:type="dxa"/>
+          </w:tcPr>
+          <w:p>
+            <w:pPr>
+              <w:rPr>
+                <w:lang w:val="en-GB"/>
+              </w:rPr>
+            </w:pPr>
+            <w:r>
+              <w:rPr>
+                <w:lang w:val="en-GB"/>
+              </w:rPr>
+              <w:t>0.92</w:t>
+            </w:r>
+          </w:p>
+        </w:tc>
+      </w:tr>
+    </w:tbl>
+    <w:p>
+      <w:pPr>
         <w:rPr>
           <w:lang w:val="en-GB"/>
         </w:rPr>
@@ -7593,7 +9047,1088 @@
     </w:p>
     <w:p>
       <w:pPr>
-        <w:jc w:val="both"/>
+        <w:rPr>
+          <w:lang w:val="en-GB"/>
+        </w:rPr>
+      </w:pPr>
+    </w:p>
+    <w:p>
+      <w:pPr>
+        <w:rPr>
+          <w:lang w:val="en-GB"/>
+        </w:rPr>
+      </w:pPr>
+    </w:p>
+    <w:p>
+      <w:pPr>
+        <w:rPr>
+          <w:lang w:val="en-GB"/>
+        </w:rPr>
+      </w:pPr>
+    </w:p>
+    <w:p>
+      <w:pPr>
+        <w:rPr>
+          <w:lang w:val="en-GB"/>
+        </w:rPr>
+      </w:pPr>
+    </w:p>
+    <w:p>
+      <w:pPr>
+        <w:rPr>
+          <w:lang w:val="en-GB"/>
+        </w:rPr>
+      </w:pPr>
+      <w:r>
+        <w:rPr>
+          <w:lang w:val="en-GB"/>
+        </w:rPr>
+        <w:lastRenderedPageBreak/>
+        <w:t>6.5.2 Grapes</w:t>
+      </w:r>
+    </w:p>
+    <w:tbl>
+      <w:tblPr>
+        <w:tblStyle w:val="Tablaconcuadrcula"/>
+        <w:tblW w:w="0" w:type="auto"/>
+        <w:tblLook w:val="04A0" w:firstRow="1" w:lastRow="0" w:firstColumn="1" w:lastColumn="0" w:noHBand="0" w:noVBand="1"/>
+      </w:tblPr>
+      <w:tblGrid>
+        <w:gridCol w:w="1728"/>
+        <w:gridCol w:w="1729"/>
+        <w:gridCol w:w="1729"/>
+        <w:gridCol w:w="1729"/>
+        <w:gridCol w:w="1729"/>
+      </w:tblGrid>
+      <w:tr>
+        <w:tc>
+          <w:tcPr>
+            <w:tcW w:w="1728" w:type="dxa"/>
+          </w:tcPr>
+          <w:p>
+            <w:pPr>
+              <w:rPr>
+                <w:b/>
+                <w:bCs/>
+                <w:lang w:val="en-GB"/>
+              </w:rPr>
+            </w:pPr>
+            <w:r>
+              <w:rPr>
+                <w:b/>
+                <w:bCs/>
+                <w:lang w:val="en-GB"/>
+              </w:rPr>
+              <w:t>Rainfall / Temperature</w:t>
+            </w:r>
+          </w:p>
+        </w:tc>
+        <w:tc>
+          <w:tcPr>
+            <w:tcW w:w="1729" w:type="dxa"/>
+          </w:tcPr>
+          <w:p>
+            <w:pPr>
+              <w:rPr>
+                <w:b/>
+                <w:bCs/>
+                <w:lang w:val="en-GB"/>
+              </w:rPr>
+            </w:pPr>
+            <w:r>
+              <w:rPr>
+                <w:b/>
+                <w:bCs/>
+                <w:lang w:val="en-GB"/>
+              </w:rPr>
+              <w:t>Cool</w:t>
+            </w:r>
+          </w:p>
+        </w:tc>
+        <w:tc>
+          <w:tcPr>
+            <w:tcW w:w="1729" w:type="dxa"/>
+          </w:tcPr>
+          <w:p>
+            <w:pPr>
+              <w:rPr>
+                <w:b/>
+                <w:bCs/>
+                <w:lang w:val="en-GB"/>
+              </w:rPr>
+            </w:pPr>
+            <w:r>
+              <w:rPr>
+                <w:b/>
+                <w:bCs/>
+                <w:lang w:val="en-GB"/>
+              </w:rPr>
+              <w:t>Normal</w:t>
+            </w:r>
+          </w:p>
+        </w:tc>
+        <w:tc>
+          <w:tcPr>
+            <w:tcW w:w="1729" w:type="dxa"/>
+          </w:tcPr>
+          <w:p>
+            <w:pPr>
+              <w:rPr>
+                <w:b/>
+                <w:bCs/>
+                <w:lang w:val="en-GB"/>
+              </w:rPr>
+            </w:pPr>
+            <w:r>
+              <w:rPr>
+                <w:b/>
+                <w:bCs/>
+                <w:lang w:val="en-GB"/>
+              </w:rPr>
+              <w:t>Warm</w:t>
+            </w:r>
+          </w:p>
+        </w:tc>
+        <w:tc>
+          <w:tcPr>
+            <w:tcW w:w="1729" w:type="dxa"/>
+          </w:tcPr>
+          <w:p>
+            <w:pPr>
+              <w:rPr>
+                <w:b/>
+                <w:bCs/>
+                <w:lang w:val="en-GB"/>
+              </w:rPr>
+            </w:pPr>
+            <w:r>
+              <w:rPr>
+                <w:b/>
+                <w:bCs/>
+                <w:lang w:val="en-GB"/>
+              </w:rPr>
+              <w:t>Very warm</w:t>
+            </w:r>
+          </w:p>
+        </w:tc>
+      </w:tr>
+      <w:tr>
+        <w:tc>
+          <w:tcPr>
+            <w:tcW w:w="1728" w:type="dxa"/>
+          </w:tcPr>
+          <w:p>
+            <w:pPr>
+              <w:rPr>
+                <w:b/>
+                <w:bCs/>
+                <w:lang w:val="en-GB"/>
+              </w:rPr>
+            </w:pPr>
+            <w:r>
+              <w:rPr>
+                <w:b/>
+                <w:bCs/>
+                <w:lang w:val="en-GB"/>
+              </w:rPr>
+              <w:t>Very dry</w:t>
+            </w:r>
+          </w:p>
+        </w:tc>
+        <w:tc>
+          <w:tcPr>
+            <w:tcW w:w="1729" w:type="dxa"/>
+          </w:tcPr>
+          <w:p>
+            <w:pPr>
+              <w:rPr>
+                <w:lang w:val="en-GB"/>
+              </w:rPr>
+            </w:pPr>
+            <w:r>
+              <w:rPr>
+                <w:lang w:val="en-GB"/>
+              </w:rPr>
+              <w:t>0.63</w:t>
+            </w:r>
+          </w:p>
+        </w:tc>
+        <w:tc>
+          <w:tcPr>
+            <w:tcW w:w="1729" w:type="dxa"/>
+          </w:tcPr>
+          <w:p>
+            <w:pPr>
+              <w:rPr>
+                <w:lang w:val="en-GB"/>
+              </w:rPr>
+            </w:pPr>
+            <w:r>
+              <w:rPr>
+                <w:lang w:val="en-GB"/>
+              </w:rPr>
+              <w:t>0.70</w:t>
+            </w:r>
+          </w:p>
+        </w:tc>
+        <w:tc>
+          <w:tcPr>
+            <w:tcW w:w="1729" w:type="dxa"/>
+          </w:tcPr>
+          <w:p>
+            <w:pPr>
+              <w:rPr>
+                <w:lang w:val="en-GB"/>
+              </w:rPr>
+            </w:pPr>
+            <w:r>
+              <w:rPr>
+                <w:lang w:val="en-GB"/>
+              </w:rPr>
+              <w:t>0.72</w:t>
+            </w:r>
+          </w:p>
+        </w:tc>
+        <w:tc>
+          <w:tcPr>
+            <w:tcW w:w="1729" w:type="dxa"/>
+          </w:tcPr>
+          <w:p>
+            <w:pPr>
+              <w:rPr>
+                <w:lang w:val="en-GB"/>
+              </w:rPr>
+            </w:pPr>
+            <w:r>
+              <w:rPr>
+                <w:lang w:val="en-GB"/>
+              </w:rPr>
+              <w:t>0.51</w:t>
+            </w:r>
+          </w:p>
+        </w:tc>
+      </w:tr>
+      <w:tr>
+        <w:tc>
+          <w:tcPr>
+            <w:tcW w:w="1728" w:type="dxa"/>
+          </w:tcPr>
+          <w:p>
+            <w:pPr>
+              <w:rPr>
+                <w:b/>
+                <w:bCs/>
+                <w:lang w:val="en-GB"/>
+              </w:rPr>
+            </w:pPr>
+            <w:r>
+              <w:rPr>
+                <w:b/>
+                <w:bCs/>
+                <w:lang w:val="en-GB"/>
+              </w:rPr>
+              <w:t>Dry</w:t>
+            </w:r>
+          </w:p>
+        </w:tc>
+        <w:tc>
+          <w:tcPr>
+            <w:tcW w:w="1729" w:type="dxa"/>
+          </w:tcPr>
+          <w:p>
+            <w:pPr>
+              <w:rPr>
+                <w:lang w:val="en-GB"/>
+              </w:rPr>
+            </w:pPr>
+            <w:r>
+              <w:rPr>
+                <w:lang w:val="en-GB"/>
+              </w:rPr>
+              <w:t>0.77</w:t>
+            </w:r>
+          </w:p>
+        </w:tc>
+        <w:tc>
+          <w:tcPr>
+            <w:tcW w:w="1729" w:type="dxa"/>
+          </w:tcPr>
+          <w:p>
+            <w:pPr>
+              <w:rPr>
+                <w:lang w:val="en-GB"/>
+              </w:rPr>
+            </w:pPr>
+            <w:r>
+              <w:rPr>
+                <w:lang w:val="en-GB"/>
+              </w:rPr>
+              <w:t>0.85</w:t>
+            </w:r>
+          </w:p>
+        </w:tc>
+        <w:tc>
+          <w:tcPr>
+            <w:tcW w:w="1729" w:type="dxa"/>
+          </w:tcPr>
+          <w:p>
+            <w:pPr>
+              <w:rPr>
+                <w:lang w:val="en-GB"/>
+              </w:rPr>
+            </w:pPr>
+            <w:r>
+              <w:rPr>
+                <w:lang w:val="en-GB"/>
+              </w:rPr>
+              <w:t>0.88</w:t>
+            </w:r>
+          </w:p>
+        </w:tc>
+        <w:tc>
+          <w:tcPr>
+            <w:tcW w:w="1729" w:type="dxa"/>
+          </w:tcPr>
+          <w:p>
+            <w:pPr>
+              <w:rPr>
+                <w:lang w:val="en-GB"/>
+              </w:rPr>
+            </w:pPr>
+            <w:r>
+              <w:rPr>
+                <w:lang w:val="en-GB"/>
+              </w:rPr>
+              <w:t>0.72</w:t>
+            </w:r>
+          </w:p>
+        </w:tc>
+      </w:tr>
+      <w:tr>
+        <w:tc>
+          <w:tcPr>
+            <w:tcW w:w="1728" w:type="dxa"/>
+          </w:tcPr>
+          <w:p>
+            <w:pPr>
+              <w:rPr>
+                <w:b/>
+                <w:bCs/>
+                <w:lang w:val="en-GB"/>
+              </w:rPr>
+            </w:pPr>
+            <w:r>
+              <w:rPr>
+                <w:b/>
+                <w:bCs/>
+                <w:lang w:val="en-GB"/>
+              </w:rPr>
+              <w:t>Normal</w:t>
+            </w:r>
+          </w:p>
+        </w:tc>
+        <w:tc>
+          <w:tcPr>
+            <w:tcW w:w="1729" w:type="dxa"/>
+          </w:tcPr>
+          <w:p>
+            <w:pPr>
+              <w:rPr>
+                <w:lang w:val="en-GB"/>
+              </w:rPr>
+            </w:pPr>
+            <w:r>
+              <w:rPr>
+                <w:lang w:val="en-GB"/>
+              </w:rPr>
+              <w:t>0.90</w:t>
+            </w:r>
+          </w:p>
+        </w:tc>
+        <w:tc>
+          <w:tcPr>
+            <w:tcW w:w="1729" w:type="dxa"/>
+          </w:tcPr>
+          <w:p>
+            <w:pPr>
+              <w:rPr>
+                <w:lang w:val="en-GB"/>
+              </w:rPr>
+            </w:pPr>
+            <w:r>
+              <w:rPr>
+                <w:lang w:val="en-GB"/>
+              </w:rPr>
+              <w:t>1.00</w:t>
+            </w:r>
+          </w:p>
+        </w:tc>
+        <w:tc>
+          <w:tcPr>
+            <w:tcW w:w="1729" w:type="dxa"/>
+          </w:tcPr>
+          <w:p>
+            <w:pPr>
+              <w:rPr>
+                <w:lang w:val="en-GB"/>
+              </w:rPr>
+            </w:pPr>
+            <w:r>
+              <w:rPr>
+                <w:lang w:val="en-GB"/>
+              </w:rPr>
+              <w:t>1.03</w:t>
+            </w:r>
+          </w:p>
+        </w:tc>
+        <w:tc>
+          <w:tcPr>
+            <w:tcW w:w="1729" w:type="dxa"/>
+          </w:tcPr>
+          <w:p>
+            <w:pPr>
+              <w:rPr>
+                <w:lang w:val="en-GB"/>
+              </w:rPr>
+            </w:pPr>
+            <w:r>
+              <w:rPr>
+                <w:lang w:val="en-GB"/>
+              </w:rPr>
+              <w:t>0.85</w:t>
+            </w:r>
+          </w:p>
+        </w:tc>
+      </w:tr>
+      <w:tr>
+        <w:tc>
+          <w:tcPr>
+            <w:tcW w:w="1728" w:type="dxa"/>
+          </w:tcPr>
+          <w:p>
+            <w:pPr>
+              <w:rPr>
+                <w:b/>
+                <w:bCs/>
+                <w:lang w:val="en-GB"/>
+              </w:rPr>
+            </w:pPr>
+            <w:r>
+              <w:rPr>
+                <w:b/>
+                <w:bCs/>
+                <w:lang w:val="en-GB"/>
+              </w:rPr>
+              <w:t>Humid</w:t>
+            </w:r>
+          </w:p>
+        </w:tc>
+        <w:tc>
+          <w:tcPr>
+            <w:tcW w:w="1729" w:type="dxa"/>
+          </w:tcPr>
+          <w:p>
+            <w:pPr>
+              <w:rPr>
+                <w:lang w:val="en-GB"/>
+              </w:rPr>
+            </w:pPr>
+            <w:r>
+              <w:rPr>
+                <w:lang w:val="en-GB"/>
+              </w:rPr>
+              <w:t>0.95</w:t>
+            </w:r>
+          </w:p>
+        </w:tc>
+        <w:tc>
+          <w:tcPr>
+            <w:tcW w:w="1729" w:type="dxa"/>
+          </w:tcPr>
+          <w:p>
+            <w:pPr>
+              <w:rPr>
+                <w:lang w:val="en-GB"/>
+              </w:rPr>
+            </w:pPr>
+            <w:r>
+              <w:rPr>
+                <w:lang w:val="en-GB"/>
+              </w:rPr>
+              <w:t>1.05</w:t>
+            </w:r>
+          </w:p>
+        </w:tc>
+        <w:tc>
+          <w:tcPr>
+            <w:tcW w:w="1729" w:type="dxa"/>
+          </w:tcPr>
+          <w:p>
+            <w:pPr>
+              <w:rPr>
+                <w:lang w:val="en-GB"/>
+              </w:rPr>
+            </w:pPr>
+            <w:r>
+              <w:rPr>
+                <w:lang w:val="en-GB"/>
+              </w:rPr>
+              <w:t>1.08</w:t>
+            </w:r>
+          </w:p>
+        </w:tc>
+        <w:tc>
+          <w:tcPr>
+            <w:tcW w:w="1729" w:type="dxa"/>
+          </w:tcPr>
+          <w:p>
+            <w:pPr>
+              <w:rPr>
+                <w:lang w:val="en-GB"/>
+              </w:rPr>
+            </w:pPr>
+            <w:r>
+              <w:rPr>
+                <w:lang w:val="en-GB"/>
+              </w:rPr>
+              <w:t>0.89</w:t>
+            </w:r>
+          </w:p>
+        </w:tc>
+      </w:tr>
+    </w:tbl>
+    <w:p>
+      <w:pPr>
+        <w:rPr>
+          <w:lang w:val="en-GB"/>
+        </w:rPr>
+      </w:pPr>
+    </w:p>
+    <w:p>
+      <w:pPr>
+        <w:rPr>
+          <w:lang w:val="en-GB"/>
+        </w:rPr>
+      </w:pPr>
+      <w:r>
+        <w:rPr>
+          <w:lang w:val="en-GB"/>
+        </w:rPr>
+        <w:t>6.5.3 Olives</w:t>
+      </w:r>
+    </w:p>
+    <w:tbl>
+      <w:tblPr>
+        <w:tblStyle w:val="Tablaconcuadrcula"/>
+        <w:tblW w:w="0" w:type="auto"/>
+        <w:tblLook w:val="04A0" w:firstRow="1" w:lastRow="0" w:firstColumn="1" w:lastColumn="0" w:noHBand="0" w:noVBand="1"/>
+      </w:tblPr>
+      <w:tblGrid>
+        <w:gridCol w:w="1728"/>
+        <w:gridCol w:w="1729"/>
+        <w:gridCol w:w="1729"/>
+        <w:gridCol w:w="1729"/>
+        <w:gridCol w:w="1729"/>
+      </w:tblGrid>
+      <w:tr>
+        <w:tc>
+          <w:tcPr>
+            <w:tcW w:w="1728" w:type="dxa"/>
+          </w:tcPr>
+          <w:p>
+            <w:pPr>
+              <w:rPr>
+                <w:b/>
+                <w:bCs/>
+                <w:lang w:val="en-GB"/>
+              </w:rPr>
+            </w:pPr>
+            <w:r>
+              <w:rPr>
+                <w:b/>
+                <w:bCs/>
+                <w:lang w:val="en-GB"/>
+              </w:rPr>
+              <w:t>Rainfall / Temperature</w:t>
+            </w:r>
+          </w:p>
+        </w:tc>
+        <w:tc>
+          <w:tcPr>
+            <w:tcW w:w="1729" w:type="dxa"/>
+          </w:tcPr>
+          <w:p>
+            <w:pPr>
+              <w:rPr>
+                <w:b/>
+                <w:bCs/>
+                <w:lang w:val="en-GB"/>
+              </w:rPr>
+            </w:pPr>
+            <w:r>
+              <w:rPr>
+                <w:b/>
+                <w:bCs/>
+                <w:lang w:val="en-GB"/>
+              </w:rPr>
+              <w:t>Cool</w:t>
+            </w:r>
+          </w:p>
+        </w:tc>
+        <w:tc>
+          <w:tcPr>
+            <w:tcW w:w="1729" w:type="dxa"/>
+          </w:tcPr>
+          <w:p>
+            <w:pPr>
+              <w:rPr>
+                <w:b/>
+                <w:bCs/>
+                <w:lang w:val="en-GB"/>
+              </w:rPr>
+            </w:pPr>
+            <w:r>
+              <w:rPr>
+                <w:b/>
+                <w:bCs/>
+                <w:lang w:val="en-GB"/>
+              </w:rPr>
+              <w:t>Normal</w:t>
+            </w:r>
+          </w:p>
+        </w:tc>
+        <w:tc>
+          <w:tcPr>
+            <w:tcW w:w="1729" w:type="dxa"/>
+          </w:tcPr>
+          <w:p>
+            <w:pPr>
+              <w:rPr>
+                <w:b/>
+                <w:bCs/>
+                <w:lang w:val="en-GB"/>
+              </w:rPr>
+            </w:pPr>
+            <w:r>
+              <w:rPr>
+                <w:b/>
+                <w:bCs/>
+                <w:lang w:val="en-GB"/>
+              </w:rPr>
+              <w:t>Warm</w:t>
+            </w:r>
+          </w:p>
+        </w:tc>
+        <w:tc>
+          <w:tcPr>
+            <w:tcW w:w="1729" w:type="dxa"/>
+          </w:tcPr>
+          <w:p>
+            <w:pPr>
+              <w:rPr>
+                <w:b/>
+                <w:bCs/>
+                <w:lang w:val="en-GB"/>
+              </w:rPr>
+            </w:pPr>
+            <w:r>
+              <w:rPr>
+                <w:b/>
+                <w:bCs/>
+                <w:lang w:val="en-GB"/>
+              </w:rPr>
+              <w:t>Very warm</w:t>
+            </w:r>
+          </w:p>
+        </w:tc>
+      </w:tr>
+      <w:tr>
+        <w:tc>
+          <w:tcPr>
+            <w:tcW w:w="1728" w:type="dxa"/>
+          </w:tcPr>
+          <w:p>
+            <w:pPr>
+              <w:rPr>
+                <w:b/>
+                <w:bCs/>
+                <w:lang w:val="en-GB"/>
+              </w:rPr>
+            </w:pPr>
+            <w:r>
+              <w:rPr>
+                <w:b/>
+                <w:bCs/>
+                <w:lang w:val="en-GB"/>
+              </w:rPr>
+              <w:t>Very dry</w:t>
+            </w:r>
+          </w:p>
+        </w:tc>
+        <w:tc>
+          <w:tcPr>
+            <w:tcW w:w="1729" w:type="dxa"/>
+          </w:tcPr>
+          <w:p>
+            <w:pPr>
+              <w:rPr>
+                <w:lang w:val="en-GB"/>
+              </w:rPr>
+            </w:pPr>
+            <w:r>
+              <w:rPr>
+                <w:lang w:val="en-GB"/>
+              </w:rPr>
+              <w:t>0.62</w:t>
+            </w:r>
+          </w:p>
+        </w:tc>
+        <w:tc>
+          <w:tcPr>
+            <w:tcW w:w="1729" w:type="dxa"/>
+          </w:tcPr>
+          <w:p>
+            <w:pPr>
+              <w:rPr>
+                <w:lang w:val="en-GB"/>
+              </w:rPr>
+            </w:pPr>
+            <w:r>
+              <w:rPr>
+                <w:lang w:val="en-GB"/>
+              </w:rPr>
+              <w:t>0.65</w:t>
+            </w:r>
+          </w:p>
+        </w:tc>
+        <w:tc>
+          <w:tcPr>
+            <w:tcW w:w="1729" w:type="dxa"/>
+          </w:tcPr>
+          <w:p>
+            <w:pPr>
+              <w:rPr>
+                <w:lang w:val="en-GB"/>
+              </w:rPr>
+            </w:pPr>
+            <w:r>
+              <w:rPr>
+                <w:lang w:val="en-GB"/>
+              </w:rPr>
+              <w:t>0.65</w:t>
+            </w:r>
+          </w:p>
+        </w:tc>
+        <w:tc>
+          <w:tcPr>
+            <w:tcW w:w="1729" w:type="dxa"/>
+          </w:tcPr>
+          <w:p>
+            <w:pPr>
+              <w:rPr>
+                <w:lang w:val="en-GB"/>
+              </w:rPr>
+            </w:pPr>
+            <w:r>
+              <w:rPr>
+                <w:lang w:val="en-GB"/>
+              </w:rPr>
+              <w:t>0.50</w:t>
+            </w:r>
+          </w:p>
+        </w:tc>
+      </w:tr>
+      <w:tr>
+        <w:tc>
+          <w:tcPr>
+            <w:tcW w:w="1728" w:type="dxa"/>
+          </w:tcPr>
+          <w:p>
+            <w:pPr>
+              <w:rPr>
+                <w:b/>
+                <w:bCs/>
+                <w:lang w:val="en-GB"/>
+              </w:rPr>
+            </w:pPr>
+            <w:r>
+              <w:rPr>
+                <w:b/>
+                <w:bCs/>
+                <w:lang w:val="en-GB"/>
+              </w:rPr>
+              <w:t>Dry</w:t>
+            </w:r>
+          </w:p>
+        </w:tc>
+        <w:tc>
+          <w:tcPr>
+            <w:tcW w:w="1729" w:type="dxa"/>
+          </w:tcPr>
+          <w:p>
+            <w:pPr>
+              <w:rPr>
+                <w:lang w:val="en-GB"/>
+              </w:rPr>
+            </w:pPr>
+            <w:r>
+              <w:rPr>
+                <w:lang w:val="en-GB"/>
+              </w:rPr>
+              <w:t>0.76</w:t>
+            </w:r>
+          </w:p>
+        </w:tc>
+        <w:tc>
+          <w:tcPr>
+            <w:tcW w:w="1729" w:type="dxa"/>
+          </w:tcPr>
+          <w:p>
+            <w:pPr>
+              <w:rPr>
+                <w:lang w:val="en-GB"/>
+              </w:rPr>
+            </w:pPr>
+            <w:r>
+              <w:rPr>
+                <w:lang w:val="en-GB"/>
+              </w:rPr>
+              <w:t>0.80</w:t>
+            </w:r>
+          </w:p>
+        </w:tc>
+        <w:tc>
+          <w:tcPr>
+            <w:tcW w:w="1729" w:type="dxa"/>
+          </w:tcPr>
+          <w:p>
+            <w:pPr>
+              <w:rPr>
+                <w:lang w:val="en-GB"/>
+              </w:rPr>
+            </w:pPr>
+            <w:r>
+              <w:rPr>
+                <w:lang w:val="en-GB"/>
+              </w:rPr>
+              <w:t>0.80</w:t>
+            </w:r>
+          </w:p>
+        </w:tc>
+        <w:tc>
+          <w:tcPr>
+            <w:tcW w:w="1729" w:type="dxa"/>
+          </w:tcPr>
+          <w:p>
+            <w:pPr>
+              <w:rPr>
+                <w:lang w:val="en-GB"/>
+              </w:rPr>
+            </w:pPr>
+            <w:r>
+              <w:rPr>
+                <w:lang w:val="en-GB"/>
+              </w:rPr>
+              <w:t>0.72</w:t>
+            </w:r>
+          </w:p>
+        </w:tc>
+      </w:tr>
+      <w:tr>
+        <w:tc>
+          <w:tcPr>
+            <w:tcW w:w="1728" w:type="dxa"/>
+          </w:tcPr>
+          <w:p>
+            <w:pPr>
+              <w:rPr>
+                <w:b/>
+                <w:bCs/>
+                <w:lang w:val="en-GB"/>
+              </w:rPr>
+            </w:pPr>
+            <w:r>
+              <w:rPr>
+                <w:b/>
+                <w:bCs/>
+                <w:lang w:val="en-GB"/>
+              </w:rPr>
+              <w:t>Normal</w:t>
+            </w:r>
+          </w:p>
+        </w:tc>
+        <w:tc>
+          <w:tcPr>
+            <w:tcW w:w="1729" w:type="dxa"/>
+          </w:tcPr>
+          <w:p>
+            <w:pPr>
+              <w:rPr>
+                <w:lang w:val="en-GB"/>
+              </w:rPr>
+            </w:pPr>
+            <w:r>
+              <w:rPr>
+                <w:lang w:val="en-GB"/>
+              </w:rPr>
+              <w:t>0.95</w:t>
+            </w:r>
+          </w:p>
+        </w:tc>
+        <w:tc>
+          <w:tcPr>
+            <w:tcW w:w="1729" w:type="dxa"/>
+          </w:tcPr>
+          <w:p>
+            <w:pPr>
+              <w:rPr>
+                <w:lang w:val="en-GB"/>
+              </w:rPr>
+            </w:pPr>
+            <w:r>
+              <w:rPr>
+                <w:lang w:val="en-GB"/>
+              </w:rPr>
+              <w:t>1.00</w:t>
+            </w:r>
+          </w:p>
+        </w:tc>
+        <w:tc>
+          <w:tcPr>
+            <w:tcW w:w="1729" w:type="dxa"/>
+          </w:tcPr>
+          <w:p>
+            <w:pPr>
+              <w:rPr>
+                <w:lang w:val="en-GB"/>
+              </w:rPr>
+            </w:pPr>
+            <w:r>
+              <w:rPr>
+                <w:lang w:val="en-GB"/>
+              </w:rPr>
+              <w:t>1.00</w:t>
+            </w:r>
+          </w:p>
+        </w:tc>
+        <w:tc>
+          <w:tcPr>
+            <w:tcW w:w="1729" w:type="dxa"/>
+          </w:tcPr>
+          <w:p>
+            <w:pPr>
+              <w:rPr>
+                <w:lang w:val="en-GB"/>
+              </w:rPr>
+            </w:pPr>
+            <w:r>
+              <w:rPr>
+                <w:lang w:val="en-GB"/>
+              </w:rPr>
+              <w:t>0.90</w:t>
+            </w:r>
+          </w:p>
+        </w:tc>
+      </w:tr>
+      <w:tr>
+        <w:tc>
+          <w:tcPr>
+            <w:tcW w:w="1728" w:type="dxa"/>
+          </w:tcPr>
+          <w:p>
+            <w:pPr>
+              <w:rPr>
+                <w:b/>
+                <w:bCs/>
+                <w:lang w:val="en-GB"/>
+              </w:rPr>
+            </w:pPr>
+            <w:r>
+              <w:rPr>
+                <w:b/>
+                <w:bCs/>
+                <w:lang w:val="en-GB"/>
+              </w:rPr>
+              <w:t>Humid</w:t>
+            </w:r>
+          </w:p>
+        </w:tc>
+        <w:tc>
+          <w:tcPr>
+            <w:tcW w:w="1729" w:type="dxa"/>
+          </w:tcPr>
+          <w:p>
+            <w:pPr>
+              <w:rPr>
+                <w:lang w:val="en-GB"/>
+              </w:rPr>
+            </w:pPr>
+            <w:r>
+              <w:rPr>
+                <w:lang w:val="en-GB"/>
+              </w:rPr>
+              <w:t>1.05</w:t>
+            </w:r>
+          </w:p>
+        </w:tc>
+        <w:tc>
+          <w:tcPr>
+            <w:tcW w:w="1729" w:type="dxa"/>
+          </w:tcPr>
+          <w:p>
+            <w:pPr>
+              <w:rPr>
+                <w:lang w:val="en-GB"/>
+              </w:rPr>
+            </w:pPr>
+            <w:r>
+              <w:rPr>
+                <w:lang w:val="en-GB"/>
+              </w:rPr>
+              <w:t>1.10</w:t>
+            </w:r>
+          </w:p>
+        </w:tc>
+        <w:tc>
+          <w:tcPr>
+            <w:tcW w:w="1729" w:type="dxa"/>
+          </w:tcPr>
+          <w:p>
+            <w:pPr>
+              <w:rPr>
+                <w:lang w:val="en-GB"/>
+              </w:rPr>
+            </w:pPr>
+            <w:r>
+              <w:rPr>
+                <w:lang w:val="en-GB"/>
+              </w:rPr>
+              <w:t>1.10</w:t>
+            </w:r>
+          </w:p>
+        </w:tc>
+        <w:tc>
+          <w:tcPr>
+            <w:tcW w:w="1729" w:type="dxa"/>
+          </w:tcPr>
+          <w:p>
+            <w:pPr>
+              <w:rPr>
+                <w:lang w:val="en-GB"/>
+              </w:rPr>
+            </w:pPr>
+            <w:r>
+              <w:rPr>
+                <w:lang w:val="en-GB"/>
+              </w:rPr>
+              <w:t>0.99</w:t>
+            </w:r>
+          </w:p>
+        </w:tc>
+      </w:tr>
+    </w:tbl>
+    <w:p>
+      <w:pPr>
         <w:rPr>
           <w:lang w:val="en-GB"/>
         </w:rPr>
@@ -7612,7 +10147,6 @@
           <w:rFonts w:ascii="Times New Roman" w:eastAsia="Times New Roman" w:hAnsi="Times New Roman" w:cs="Times New Roman"/>
           <w:lang w:val="en-GB"/>
         </w:rPr>
-        <w:lastRenderedPageBreak/>
         <w:t>7</w:t>
       </w:r>
       <w:r>
@@ -8242,6 +10776,7 @@
           <w:rFonts w:ascii="Times New Roman" w:eastAsia="Times New Roman" w:hAnsi="Times New Roman" w:cs="Times New Roman"/>
           <w:lang w:val="en-GB"/>
         </w:rPr>
+        <w:lastRenderedPageBreak/>
         <w:t>7</w:t>
       </w:r>
       <w:r>
@@ -8961,38 +11496,6 @@
     </w:p>
     <w:p>
       <w:pPr>
-        <w:jc w:val="both"/>
-        <w:rPr>
-          <w:lang w:val="en-GB"/>
-        </w:rPr>
-      </w:pPr>
-    </w:p>
-    <w:p>
-      <w:pPr>
-        <w:jc w:val="both"/>
-        <w:rPr>
-          <w:lang w:val="en-GB"/>
-        </w:rPr>
-      </w:pPr>
-    </w:p>
-    <w:p>
-      <w:pPr>
-        <w:jc w:val="both"/>
-        <w:rPr>
-          <w:lang w:val="en-GB"/>
-        </w:rPr>
-      </w:pPr>
-    </w:p>
-    <w:p>
-      <w:pPr>
-        <w:jc w:val="both"/>
-        <w:rPr>
-          <w:lang w:val="en-GB"/>
-        </w:rPr>
-      </w:pPr>
-    </w:p>
-    <w:p>
-      <w:pPr>
         <w:pStyle w:val="Ttulo2"/>
         <w:jc w:val="both"/>
         <w:rPr>
@@ -9004,7 +11507,6 @@
           <w:rFonts w:ascii="Times New Roman" w:eastAsia="Times New Roman" w:hAnsi="Times New Roman" w:cs="Times New Roman"/>
           <w:lang w:val="en-GB"/>
         </w:rPr>
-        <w:lastRenderedPageBreak/>
         <w:t>7</w:t>
       </w:r>
       <w:r>
@@ -10141,6 +12643,7 @@
           <w:rFonts w:ascii="Times New Roman" w:eastAsia="Times New Roman" w:hAnsi="Times New Roman" w:cs="Times New Roman"/>
           <w:lang w:val="en-GB"/>
         </w:rPr>
+        <w:lastRenderedPageBreak/>
         <w:t>8</w:t>
       </w:r>
       <w:r>
@@ -11124,7 +13627,6 @@
           <w:rFonts w:ascii="Times New Roman" w:eastAsia="Times New Roman" w:hAnsi="Times New Roman" w:cs="Times New Roman"/>
           <w:lang w:val="en-GB"/>
         </w:rPr>
-        <w:lastRenderedPageBreak/>
         <w:t>8</w:t>
       </w:r>
       <w:r>
@@ -12327,6 +14829,7 @@
           <w:rFonts w:ascii="Times New Roman" w:eastAsia="Times New Roman" w:hAnsi="Times New Roman" w:cs="Times New Roman"/>
           <w:lang w:val="en-GB"/>
         </w:rPr>
+        <w:lastRenderedPageBreak/>
         <w:t>1</w:t>
       </w:r>
       <w:r>
@@ -12627,7 +15130,6 @@
           <w:rFonts w:ascii="Times New Roman" w:eastAsia="Times New Roman" w:hAnsi="Times New Roman" w:cs="Times New Roman"/>
           <w:lang w:val="en-GB"/>
         </w:rPr>
-        <w:lastRenderedPageBreak/>
         <w:t>1</w:t>
       </w:r>
       <w:r>
@@ -13700,6 +16202,7 @@
                 <w:sz w:val="21"/>
                 <w:lang w:val="en-GB"/>
               </w:rPr>
+              <w:lastRenderedPageBreak/>
               <w:t>Elderly person</w:t>
             </w:r>
           </w:p>
@@ -13872,7 +16375,6 @@
           <w:szCs w:val="28"/>
           <w:lang w:val="en-GB"/>
         </w:rPr>
-        <w:lastRenderedPageBreak/>
         <w:t>1</w:t>
       </w:r>
       <w:r>
@@ -14864,6 +17366,7 @@
                 <w:sz w:val="21"/>
                 <w:lang w:val="en-GB"/>
               </w:rPr>
+              <w:lastRenderedPageBreak/>
               <w:t>Adolescent</w:t>
             </w:r>
           </w:p>
@@ -15376,7 +17879,6 @@
                 <w:sz w:val="21"/>
                 <w:lang w:val="en-GB"/>
               </w:rPr>
-              <w:lastRenderedPageBreak/>
               <w:t>1.00–1.20</w:t>
             </w:r>
           </w:p>
@@ -16302,7 +18804,15 @@
                 <w:sz w:val="21"/>
                 <w:lang w:val="en-GB"/>
               </w:rPr>
-              <w:t>Age-independent mortality: accidents, infections, violence or other risks not strictly related to senescence.</w:t>
+              <w:t xml:space="preserve">Age-independent mortality: accidents, infections, violence or other risks not </w:t>
+            </w:r>
+            <w:r>
+              <w:rPr>
+                <w:sz w:val="21"/>
+                <w:lang w:val="en-GB"/>
+              </w:rPr>
+              <w:lastRenderedPageBreak/>
+              <w:t>strictly related to senescence.</w:t>
             </w:r>
           </w:p>
         </w:tc>
@@ -16334,6 +18844,7 @@
                 <w:sz w:val="21"/>
                 <w:lang w:val="en-GB"/>
               </w:rPr>
+              <w:lastRenderedPageBreak/>
               <w:t>B · e^(</w:t>
             </w:r>
             <w:proofErr w:type="spellStart"/>
@@ -16978,7 +19489,6 @@
                 <w:sz w:val="21"/>
                 <w:lang w:val="en-GB"/>
               </w:rPr>
-              <w:lastRenderedPageBreak/>
               <w:t>1.00–1.20</w:t>
             </w:r>
           </w:p>
@@ -17957,6 +20467,7 @@
         <w:rPr>
           <w:lang w:val="en-GB"/>
         </w:rPr>
+        <w:lastRenderedPageBreak/>
         <w:t>The maximum household size can be fixed at 6 adults of working age, equivalent to two nuclear families with three labouring adults each. Farms should therefore not grow beyond about 12 individuals, of whom approximately 6 would be adults of working age.</w:t>
       </w:r>
     </w:p>
@@ -18151,7 +20662,6 @@
         <w:rPr>
           <w:lang w:val="en-GB"/>
         </w:rPr>
-        <w:lastRenderedPageBreak/>
         <w:t>6) If this still does not suffice, and no further available cells can be added without exceeding the settlement’s land or labour capacity, the model begins to reassign commercial cells to pure wheat. Vineyard cells are converted first, since they do not contribute to cereal production. If this remains insufficient, pure olive-grove cells are converted next, and finally mixed olive-grove + wheat cells may also be converted into pure wheat.</w:t>
       </w:r>
     </w:p>
@@ -30484,6 +32994,80 @@
       </w:tcPr>
     </w:tblStylePr>
   </w:style>
+  <w:style w:type="table" w:styleId="Tabladelista4">
+    <w:name w:val="List Table 4"/>
+    <w:basedOn w:val="Tablanormal"/>
+    <w:uiPriority w:val="49"/>
+    <w:rsid w:val="0040020D"/>
+    <w:pPr>
+      <w:spacing w:after="0" w:line="240" w:lineRule="auto"/>
+    </w:pPr>
+    <w:tblPr>
+      <w:tblStyleRowBandSize w:val="1"/>
+      <w:tblStyleColBandSize w:val="1"/>
+      <w:tblBorders>
+        <w:top w:val="single" w:sz="4" w:space="0" w:color="666666" w:themeColor="text1" w:themeTint="99"/>
+        <w:left w:val="single" w:sz="4" w:space="0" w:color="666666" w:themeColor="text1" w:themeTint="99"/>
+        <w:bottom w:val="single" w:sz="4" w:space="0" w:color="666666" w:themeColor="text1" w:themeTint="99"/>
+        <w:right w:val="single" w:sz="4" w:space="0" w:color="666666" w:themeColor="text1" w:themeTint="99"/>
+        <w:insideH w:val="single" w:sz="4" w:space="0" w:color="666666" w:themeColor="text1" w:themeTint="99"/>
+      </w:tblBorders>
+    </w:tblPr>
+    <w:tblStylePr w:type="firstRow">
+      <w:rPr>
+        <w:b/>
+        <w:bCs/>
+        <w:color w:val="FFFFFF" w:themeColor="background1"/>
+      </w:rPr>
+      <w:tblPr/>
+      <w:tcPr>
+        <w:tcBorders>
+          <w:top w:val="single" w:sz="4" w:space="0" w:color="000000" w:themeColor="text1"/>
+          <w:left w:val="single" w:sz="4" w:space="0" w:color="000000" w:themeColor="text1"/>
+          <w:bottom w:val="single" w:sz="4" w:space="0" w:color="000000" w:themeColor="text1"/>
+          <w:right w:val="single" w:sz="4" w:space="0" w:color="000000" w:themeColor="text1"/>
+          <w:insideH w:val="nil"/>
+        </w:tcBorders>
+        <w:shd w:val="clear" w:color="auto" w:fill="000000" w:themeFill="text1"/>
+      </w:tcPr>
+    </w:tblStylePr>
+    <w:tblStylePr w:type="lastRow">
+      <w:rPr>
+        <w:b/>
+        <w:bCs/>
+      </w:rPr>
+      <w:tblPr/>
+      <w:tcPr>
+        <w:tcBorders>
+          <w:top w:val="double" w:sz="4" w:space="0" w:color="666666" w:themeColor="text1" w:themeTint="99"/>
+        </w:tcBorders>
+      </w:tcPr>
+    </w:tblStylePr>
+    <w:tblStylePr w:type="firstCol">
+      <w:rPr>
+        <w:b/>
+        <w:bCs/>
+      </w:rPr>
+    </w:tblStylePr>
+    <w:tblStylePr w:type="lastCol">
+      <w:rPr>
+        <w:b/>
+        <w:bCs/>
+      </w:rPr>
+    </w:tblStylePr>
+    <w:tblStylePr w:type="band1Vert">
+      <w:tblPr/>
+      <w:tcPr>
+        <w:shd w:val="clear" w:color="auto" w:fill="CCCCCC" w:themeFill="text1" w:themeFillTint="33"/>
+      </w:tcPr>
+    </w:tblStylePr>
+    <w:tblStylePr w:type="band1Horz">
+      <w:tblPr/>
+      <w:tcPr>
+        <w:shd w:val="clear" w:color="auto" w:fill="CCCCCC" w:themeFill="text1" w:themeFillTint="33"/>
+      </w:tcPr>
+    </w:tblStylePr>
+  </w:style>
 </w:styles>
 </file>
 

</xml_diff>